<commit_message>
docs: record verified external copy of private MVP release
</commit_message>
<xml_diff>
--- a/docs/LEVERAGE_MVP_privato_consegna.docx
+++ b/docs/LEVERAGE_MVP_privato_consegna.docx
@@ -336,6 +336,81 @@
       </w:pPr>
       <w:r>
         <w:t>Verifica e ripristino non distruttivo</w:t>
+      </w:r>
+    </w:p>
+    <w:p/>
+    <w:p>
+      <w:pPr>
+        <w:pStyle w:val="Heading3"/>
+      </w:pPr>
+      <w:r>
+        <w:t>Copia esterna verificata il 7 ottobre 2026</w:t>
+      </w:r>
+    </w:p>
+    <w:p/>
+    <w:p>
+      <w:r>
+        <w:t>Il pacchetto della release e stato copiato integralmente in</w:t>
+      </w:r>
+    </w:p>
+    <w:p>
+      <w:r>
+        <w:t>/Volumes/Disco Esterno/LEVERAGE/mvp-private-20261007/.</w:t>
+      </w:r>
+    </w:p>
+    <w:p>
+      <w:r>
+        <w:t>Verificati tutti i 1.733 file (1.196.464.964 byte) con SHA-256 e dimensioni;</w:t>
+      </w:r>
+    </w:p>
+    <w:p>
+      <w:r>
+        <w:t>integrita SQLite e chiavi esterne nuovamente controllate su backup/ e</w:t>
+      </w:r>
+    </w:p>
+    <w:p>
+      <w:r>
+        <w:t>restore-check/, senza errori. La ricevuta completa si trova accanto alla</w:t>
+      </w:r>
+    </w:p>
+    <w:p>
+      <w:r>
+        <w:t>cartella, in LEVERAGE/mvp-private-20261007-external-copy-verification.json;</w:t>
+      </w:r>
+    </w:p>
+    <w:p>
+      <w:r>
+        <w:t>una copia della ricevuta e conservata anche in private_releases/ sul Mac.</w:t>
+      </w:r>
+    </w:p>
+    <w:p/>
+    <w:p>
+      <w:r>
+        <w:t>Il supporto NON e cifrato: custodirlo in modo riservato e usare Espelli nel</w:t>
+      </w:r>
+    </w:p>
+    <w:p>
+      <w:r>
+        <w:t>Finder prima di scollegarlo. La copia protegge la baseline della release,</w:t>
+      </w:r>
+    </w:p>
+    <w:p>
+      <w:r>
+        <w:t>non include automaticamente le modifiche successive del database e non</w:t>
+      </w:r>
+    </w:p>
+    <w:p>
+      <w:r>
+        <w:t>sostituisce la protezione dalla perdita o dal furto del supporto.</w:t>
+      </w:r>
+    </w:p>
+    <w:p/>
+    <w:p>
+      <w:pPr>
+        <w:pStyle w:val="Heading3"/>
+      </w:pPr>
+      <w:r>
+        <w:t>Comandi</w:t>
       </w:r>
     </w:p>
     <w:p/>

</xml_diff>